<commit_message>
docs: reescribir §9 uso de IA en MEMORIA_SIMPLE (enfoque asesor, no ejecutor)
</commit_message>
<xml_diff>
--- a/docs/MEMORIA_SIMPLE.docx
+++ b/docs/MEMORIA_SIMPLE.docx
@@ -7851,7 +7851,7 @@
         <w:pStyle w:val="FirstParagraph"/>
       </w:pPr>
       <w:r>
-        <w:t xml:space="preserve">Usamos la IA como un compañero de programación, no como un sustituto. La diferencia es importante: el compañero propone, nosotros decidimos.</w:t>
+        <w:t xml:space="preserve">Trabajamos con la IA como si fuera un asesor: le planteábamos un problema, ella nos ofrecía opciones y argumentos, y nosotros tomábamos la decisión, manteniendo en cada momento la dirección del proyecto.</w:t>
       </w:r>
     </w:p>
     <w:p>
@@ -7867,13 +7867,13 @@
           <w:bCs/>
           <w:b/>
         </w:rPr>
-        <w:t xml:space="preserve">Para escribir código:</w:t>
-      </w:r>
-      <w:r>
-        <w:t xml:space="preserve"> </w:t>
-      </w:r>
-      <w:r>
-        <w:t xml:space="preserve">la IA generó borradores iniciales de las rutas del servidor, las validaciones y la capa de red de la app Android. Todos fueron revisados, probados y adaptados antes de incluirlos en el proyecto.</w:t>
+        <w:t xml:space="preserve">Para las decisiones técnicas:</w:t>
+      </w:r>
+      <w:r>
+        <w:t xml:space="preserve"> </w:t>
+      </w:r>
+      <w:r>
+        <w:t xml:space="preserve">cuando había que elegir entre varias formas de resolver algo (por ejemplo, cómo guardar sesiones o cómo estructurar la base de datos), la IA explicaba las alternativas y sus consecuencias. La elección final, con su justificación, era nuestra.</w:t>
       </w:r>
     </w:p>
     <w:p>
@@ -7889,13 +7889,13 @@
           <w:bCs/>
           <w:b/>
         </w:rPr>
-        <w:t xml:space="preserve">Para el diseño visual:</w:t>
-      </w:r>
-      <w:r>
-        <w:t xml:space="preserve"> </w:t>
-      </w:r>
-      <w:r>
-        <w:t xml:space="preserve">cuando el sistema de diseño de la segunda versión resultó demasiado recargado, usamos la IA para explorar alternativas más limpias hasta llegar a la versión actual.</w:t>
+        <w:t xml:space="preserve">Para escribir código:</w:t>
+      </w:r>
+      <w:r>
+        <w:t xml:space="preserve"> </w:t>
+      </w:r>
+      <w:r>
+        <w:t xml:space="preserve">la IA proponía una solución; nosotros la leíamos, evaluábamos si tenía sentido dentro del proyecto y la incorporábamos, modificábamos o descartábamos. Nada entró en el proyecto sin que lo entendiéramos primero.</w:t>
       </w:r>
     </w:p>
     <w:p>
@@ -7911,13 +7911,13 @@
           <w:bCs/>
           <w:b/>
         </w:rPr>
-        <w:t xml:space="preserve">Para la documentación:</w:t>
-      </w:r>
-      <w:r>
-        <w:t xml:space="preserve"> </w:t>
-      </w:r>
-      <w:r>
-        <w:t xml:space="preserve">la IA ayudó a redactar el borrador inicial de esta memoria, el README del proyecto y el registro de cambios. Todo fue revisado y corregido manualmente.</w:t>
+        <w:t xml:space="preserve">Para el diseño visual:</w:t>
+      </w:r>
+      <w:r>
+        <w:t xml:space="preserve"> </w:t>
+      </w:r>
+      <w:r>
+        <w:t xml:space="preserve">cuando algo no nos convencía estéticamente, pedíamos a la IA que argumentara alternativas. Nosotros decidíamos qué dirección tomar y supervisábamos cada cambio.</w:t>
       </w:r>
     </w:p>
     <w:p>
@@ -7939,7 +7939,7 @@
         <w:t xml:space="preserve"> </w:t>
       </w:r>
       <w:r>
-        <w:t xml:space="preserve">cuando la aplicación tenía comportamientos extraños (el Service Worker que no se actualizaba, los problemas de concurrencia en las reservas, la configuración de MySQL en diferentes máquinas), la IA ayudó a diagnosticar las causas.</w:t>
+        <w:t xml:space="preserve">la IA sugería posibles causas; nosotros las comprobábamos una a una hasta encontrar la real.</w:t>
       </w:r>
     </w:p>
     <w:p>
@@ -7955,35 +7955,13 @@
           <w:bCs/>
           <w:b/>
         </w:rPr>
-        <w:t xml:space="preserve">Para la base de datos:</w:t>
-      </w:r>
-      <w:r>
-        <w:t xml:space="preserve"> </w:t>
-      </w:r>
-      <w:r>
-        <w:t xml:space="preserve">el esquema inicial de las tablas y los índices se diseñaron con ayuda de la IA, y luego se validaron con datos reales.</w:t>
-      </w:r>
-    </w:p>
-    <w:p>
-      <w:pPr>
-        <w:numPr>
-          <w:ilvl w:val="0"/>
-          <w:numId w:val="1022"/>
-        </w:numPr>
-        <w:pStyle w:val="Compact"/>
-      </w:pPr>
-      <w:r>
-        <w:rPr>
-          <w:bCs/>
-          <w:b/>
-        </w:rPr>
-        <w:t xml:space="preserve">Para las pruebas:</w:t>
-      </w:r>
-      <w:r>
-        <w:t xml:space="preserve"> </w:t>
-      </w:r>
-      <w:r>
-        <w:t xml:space="preserve">la IA generó la estructura inicial de los tests; los casos límite más interesantes (concurrencia, comprobación de permisos) los ampliamos nosotros manualmente.</w:t>
+        <w:t xml:space="preserve">Para la documentación:</w:t>
+      </w:r>
+      <w:r>
+        <w:t xml:space="preserve"> </w:t>
+      </w:r>
+      <w:r>
+        <w:t xml:space="preserve">la IA proponía borradores; los autores los reescribían para que reflejaran con exactitud lo que habíamos hecho y por qué.</w:t>
       </w:r>
     </w:p>
     <w:bookmarkEnd w:id="87"/>
@@ -8001,81 +7979,7 @@
         <w:pStyle w:val="FirstParagraph"/>
       </w:pPr>
       <w:r>
-        <w:t xml:space="preserve">Cada vez que la IA generaba algo, lo hacíamos pasar por tres filtros antes de usarlo:</w:t>
-      </w:r>
-    </w:p>
-    <w:p>
-      <w:pPr>
-        <w:numPr>
-          <w:ilvl w:val="0"/>
-          <w:numId w:val="1023"/>
-        </w:numPr>
-        <w:pStyle w:val="Compact"/>
-      </w:pPr>
-      <w:r>
-        <w:rPr>
-          <w:bCs/>
-          <w:b/>
-        </w:rPr>
-        <w:t xml:space="preserve">Lectura crítica:</w:t>
-      </w:r>
-      <w:r>
-        <w:t xml:space="preserve"> </w:t>
-      </w:r>
-      <w:r>
-        <w:t xml:space="preserve">¿tiene sentido lo que propone? ¿encaja con el resto del proyecto?</w:t>
-      </w:r>
-    </w:p>
-    <w:p>
-      <w:pPr>
-        <w:numPr>
-          <w:ilvl w:val="0"/>
-          <w:numId w:val="1023"/>
-        </w:numPr>
-        <w:pStyle w:val="Compact"/>
-      </w:pPr>
-      <w:r>
-        <w:rPr>
-          <w:bCs/>
-          <w:b/>
-        </w:rPr>
-        <w:t xml:space="preserve">Pruebas locales:</w:t>
-      </w:r>
-      <w:r>
-        <w:t xml:space="preserve"> </w:t>
-      </w:r>
-      <w:r>
-        <w:t xml:space="preserve">ejecutar el código y comprobar que funciona en los casos normales y en los casos límite.</w:t>
-      </w:r>
-    </w:p>
-    <w:p>
-      <w:pPr>
-        <w:numPr>
-          <w:ilvl w:val="0"/>
-          <w:numId w:val="1023"/>
-        </w:numPr>
-        <w:pStyle w:val="Compact"/>
-      </w:pPr>
-      <w:r>
-        <w:rPr>
-          <w:bCs/>
-          <w:b/>
-        </w:rPr>
-        <w:t xml:space="preserve">Ajuste de estilo:</w:t>
-      </w:r>
-      <w:r>
-        <w:t xml:space="preserve"> </w:t>
-      </w:r>
-      <w:r>
-        <w:t xml:space="preserve">el código generado por IA tiende a ser más formal o a usar convenciones distintas a las del resto del proyecto, así que siempre hay que homogeneizarlo.</w:t>
-      </w:r>
-    </w:p>
-    <w:p>
-      <w:pPr>
-        <w:pStyle w:val="FirstParagraph"/>
-      </w:pPr>
-      <w:r>
-        <w:t xml:space="preserve">La IA también tiene limitaciones que aprendimos a gestionar: a veces propone soluciones innecesariamente complejas, a veces usa versiones antiguas de librerías, y pierde el contexto del proyecto en conversaciones largas.</w:t>
+        <w:t xml:space="preserve">La regla que seguimos siempre fue: si no lo entiendo, no lo uso. Antes de incorporar cualquier sugerencia nos preguntábamos si seríamos capaces de explicarla en una defensa. Si la respuesta era no, se descartaba o se rediseñaba hasta que lo fuera.</w:t>
       </w:r>
     </w:p>
     <w:p>
@@ -8083,17 +7987,7 @@
         <w:pStyle w:val="BodyText"/>
       </w:pPr>
       <w:r>
-        <w:rPr>
-          <w:bCs/>
-          <w:b/>
-        </w:rPr>
-        <w:t xml:space="preserve">Conclusión:</w:t>
-      </w:r>
-      <w:r>
-        <w:t xml:space="preserve"> </w:t>
-      </w:r>
-      <w:r>
-        <w:t xml:space="preserve">la IA fue una herramienta muy útil para acelerar las partes más repetitivas del desarrollo, pero la responsabilidad sobre las decisiones de diseño y la calidad del código final es nuestra.</w:t>
+        <w:t xml:space="preserve">La IA también tiene sus límites: a veces propone soluciones más complicadas de lo necesario, a veces usa versiones antiguas de librerías y puede perder el hilo en conversaciones largas. Lo gestionamos manteniendo un documento de contexto del proyecto que le pasábamos al inicio de cada sesión.</w:t>
       </w:r>
     </w:p>
     <w:p>
@@ -8805,7 +8699,7 @@
       <w:pPr>
         <w:numPr>
           <w:ilvl w:val="0"/>
-          <w:numId w:val="1024"/>
+          <w:numId w:val="1023"/>
         </w:numPr>
         <w:pStyle w:val="Compact"/>
       </w:pPr>
@@ -8821,6 +8715,186 @@
       </w:r>
       <w:r>
         <w:t xml:space="preserve">en algunos ordenadores, el puerto 3306 de MySQL ya está en uso por otra instancia. El script de arranque detecta este caso y cambia automáticamente al puerto 3307.</w:t>
+      </w:r>
+    </w:p>
+    <w:p>
+      <w:pPr>
+        <w:numPr>
+          <w:ilvl w:val="0"/>
+          <w:numId w:val="1023"/>
+        </w:numPr>
+        <w:pStyle w:val="Compact"/>
+      </w:pPr>
+      <w:r>
+        <w:rPr>
+          <w:bCs/>
+          <w:b/>
+        </w:rPr>
+        <w:t xml:space="preserve">Reservas duplicadas:</w:t>
+      </w:r>
+      <w:r>
+        <w:t xml:space="preserve"> </w:t>
+      </w:r>
+      <w:r>
+        <w:t xml:space="preserve">al principio era posible que dos usuarios reservaran el mismo producto al mismo tiempo y juntos superaran el stock. Lo resolvimos bloqueando temporalmente el registro del producto en la base de datos durante la transacción de reserva.</w:t>
+      </w:r>
+    </w:p>
+    <w:p>
+      <w:pPr>
+        <w:numPr>
+          <w:ilvl w:val="0"/>
+          <w:numId w:val="1023"/>
+        </w:numPr>
+        <w:pStyle w:val="Compact"/>
+      </w:pPr>
+      <w:r>
+        <w:rPr>
+          <w:bCs/>
+          <w:b/>
+        </w:rPr>
+        <w:t xml:space="preserve">Token que cambia al reiniciar:</w:t>
+      </w:r>
+      <w:r>
+        <w:t xml:space="preserve"> </w:t>
+      </w:r>
+      <w:r>
+        <w:t xml:space="preserve">el token de acceso se firmaba con una clave generada al azar en cada arranque, lo que invalidaba todas las sesiones activas cada vez que se reiniciaba el servidor. Lo solucionamos guardando la clave en el archivo</w:t>
+      </w:r>
+      <w:r>
+        <w:t xml:space="preserve"> </w:t>
+      </w:r>
+      <w:r>
+        <w:rPr>
+          <w:rStyle w:val="VerbatimChar"/>
+        </w:rPr>
+        <w:t xml:space="preserve">.env</w:t>
+      </w:r>
+      <w:r>
+        <w:t xml:space="preserve"> </w:t>
+      </w:r>
+      <w:r>
+        <w:t xml:space="preserve">la primera vez que se genera.</w:t>
+      </w:r>
+    </w:p>
+    <w:p>
+      <w:pPr>
+        <w:numPr>
+          <w:ilvl w:val="0"/>
+          <w:numId w:val="1023"/>
+        </w:numPr>
+        <w:pStyle w:val="Compact"/>
+      </w:pPr>
+      <w:r>
+        <w:rPr>
+          <w:bCs/>
+          <w:b/>
+        </w:rPr>
+        <w:t xml:space="preserve">PWA</w:t>
+      </w:r>
+      <w:r>
+        <w:rPr>
+          <w:bCs/>
+          <w:b/>
+        </w:rPr>
+        <w:t xml:space="preserve"> </w:t>
+      </w:r>
+      <w:r>
+        <w:rPr>
+          <w:bCs/>
+          <w:b/>
+        </w:rPr>
+        <w:t xml:space="preserve">“</w:t>
+      </w:r>
+      <w:r>
+        <w:rPr>
+          <w:bCs/>
+          <w:b/>
+        </w:rPr>
+        <w:t xml:space="preserve">pegada</w:t>
+      </w:r>
+      <w:r>
+        <w:rPr>
+          <w:bCs/>
+          <w:b/>
+        </w:rPr>
+        <w:t xml:space="preserve">”</w:t>
+      </w:r>
+      <w:r>
+        <w:rPr>
+          <w:bCs/>
+          <w:b/>
+        </w:rPr>
+        <w:t xml:space="preserve"> </w:t>
+      </w:r>
+      <w:r>
+        <w:rPr>
+          <w:bCs/>
+          <w:b/>
+        </w:rPr>
+        <w:t xml:space="preserve">en versión vieja:</w:t>
+      </w:r>
+      <w:r>
+        <w:t xml:space="preserve"> </w:t>
+      </w:r>
+      <w:r>
+        <w:t xml:space="preserve">cuando actualizábamos la aplicación, algunos usuarios seguían viendo la versión anterior porque el navegador la había guardado en caché. Lo resolvimos con un Service Worker especial que detecta las cachés antiguas y las elimina automáticamente.</w:t>
+      </w:r>
+    </w:p>
+    <w:p>
+      <w:pPr>
+        <w:numPr>
+          <w:ilvl w:val="0"/>
+          <w:numId w:val="1023"/>
+        </w:numPr>
+        <w:pStyle w:val="Compact"/>
+      </w:pPr>
+      <w:r>
+        <w:rPr>
+          <w:bCs/>
+          <w:b/>
+        </w:rPr>
+        <w:t xml:space="preserve">Diseño demasiado recargado:</w:t>
+      </w:r>
+      <w:r>
+        <w:t xml:space="preserve"> </w:t>
+      </w:r>
+      <w:r>
+        <w:t xml:space="preserve">la segunda versión del diseño resultó visualmente saturada. Hicimos un rediseño completo a la tercera versión, más limpia y legible.</w:t>
+      </w:r>
+    </w:p>
+    <w:p>
+      <w:r>
+        <w:pict>
+          <v:rect style="width:0;height:1.5pt" o:hralign="center" o:hrstd="t" o:hr="t"/>
+        </w:pict>
+      </w:r>
+    </w:p>
+    <w:bookmarkEnd w:id="93"/>
+    <w:bookmarkEnd w:id="94"/>
+    <w:bookmarkStart w:id="99" w:name="conclusiones"/>
+    <w:p>
+      <w:pPr>
+        <w:pStyle w:val="Heading1"/>
+      </w:pPr>
+      <w:r>
+        <w:t xml:space="preserve">11. Conclusiones</w:t>
+      </w:r>
+    </w:p>
+    <w:bookmarkStart w:id="95" w:name="resultados-obtenidos-1"/>
+    <w:p>
+      <w:pPr>
+        <w:pStyle w:val="Heading2"/>
+      </w:pPr>
+      <w:r>
+        <w:t xml:space="preserve">11.1 Resultados obtenidos</w:t>
+      </w:r>
+    </w:p>
+    <w:p>
+      <w:pPr>
+        <w:pStyle w:val="FirstParagraph"/>
+      </w:pPr>
+      <w:r>
+        <w:t xml:space="preserve">El proyecto ha producido un sistema completo y funcional:</w:t>
       </w:r>
     </w:p>
     <w:p>
@@ -8832,17 +8906,23 @@
         <w:pStyle w:val="Compact"/>
       </w:pPr>
       <w:r>
+        <w:t xml:space="preserve">Una</w:t>
+      </w:r>
+      <w:r>
+        <w:t xml:space="preserve"> </w:t>
+      </w:r>
+      <w:r>
         <w:rPr>
           <w:bCs/>
           <w:b/>
         </w:rPr>
-        <w:t xml:space="preserve">Reservas duplicadas:</w:t>
-      </w:r>
-      <w:r>
-        <w:t xml:space="preserve"> </w:t>
-      </w:r>
-      <w:r>
-        <w:t xml:space="preserve">al principio era posible que dos usuarios reservaran el mismo producto al mismo tiempo y juntos superaran el stock. Lo resolvimos bloqueando temporalmente el registro del producto en la base de datos durante la transacción de reserva.</w:t>
+        <w:t xml:space="preserve">página web</w:t>
+      </w:r>
+      <w:r>
+        <w:t xml:space="preserve"> </w:t>
+      </w:r>
+      <w:r>
+        <w:t xml:space="preserve">instalable como aplicación de escritorio, con catálogo de 500 productos, gestión completa de reservas, panel de estadísticas, importación y exportación de datos en CSV, e instaladores para Windows.</w:t>
       </w:r>
     </w:p>
     <w:p>
@@ -8854,32 +8934,23 @@
         <w:pStyle w:val="Compact"/>
       </w:pPr>
       <w:r>
+        <w:t xml:space="preserve">Una</w:t>
+      </w:r>
+      <w:r>
+        <w:t xml:space="preserve"> </w:t>
+      </w:r>
+      <w:r>
         <w:rPr>
           <w:bCs/>
           <w:b/>
         </w:rPr>
-        <w:t xml:space="preserve">Token que cambia al reiniciar:</w:t>
-      </w:r>
-      <w:r>
-        <w:t xml:space="preserve"> </w:t>
-      </w:r>
-      <w:r>
-        <w:t xml:space="preserve">el token de acceso se firmaba con una clave generada al azar en cada arranque, lo que invalidaba todas las sesiones activas cada vez que se reiniciaba el servidor. Lo solucionamos guardando la clave en el archivo</w:t>
-      </w:r>
-      <w:r>
-        <w:t xml:space="preserve"> </w:t>
-      </w:r>
-      <w:r>
-        <w:rPr>
-          <w:rStyle w:val="VerbatimChar"/>
-        </w:rPr>
-        <w:t xml:space="preserve">.env</w:t>
-      </w:r>
-      <w:r>
-        <w:t xml:space="preserve"> </w:t>
-      </w:r>
-      <w:r>
-        <w:t xml:space="preserve">la primera vez que se genera.</w:t>
+        <w:t xml:space="preserve">aplicación Android nativa</w:t>
+      </w:r>
+      <w:r>
+        <w:t xml:space="preserve"> </w:t>
+      </w:r>
+      <w:r>
+        <w:t xml:space="preserve">que permite al operario gestionar las reservas del almacén desde su móvil, con sesión cifrada y cuatro pantallas funcionales.</w:t>
       </w:r>
     </w:p>
     <w:p>
@@ -8891,59 +8962,23 @@
         <w:pStyle w:val="Compact"/>
       </w:pPr>
       <w:r>
+        <w:t xml:space="preserve">Un</w:t>
+      </w:r>
+      <w:r>
+        <w:t xml:space="preserve"> </w:t>
+      </w:r>
+      <w:r>
         <w:rPr>
           <w:bCs/>
           <w:b/>
         </w:rPr>
-        <w:t xml:space="preserve">PWA</w:t>
-      </w:r>
-      <w:r>
-        <w:rPr>
-          <w:bCs/>
-          <w:b/>
-        </w:rPr>
-        <w:t xml:space="preserve"> </w:t>
-      </w:r>
-      <w:r>
-        <w:rPr>
-          <w:bCs/>
-          <w:b/>
-        </w:rPr>
-        <w:t xml:space="preserve">“</w:t>
-      </w:r>
-      <w:r>
-        <w:rPr>
-          <w:bCs/>
-          <w:b/>
-        </w:rPr>
-        <w:t xml:space="preserve">pegada</w:t>
-      </w:r>
-      <w:r>
-        <w:rPr>
-          <w:bCs/>
-          <w:b/>
-        </w:rPr>
-        <w:t xml:space="preserve">”</w:t>
-      </w:r>
-      <w:r>
-        <w:rPr>
-          <w:bCs/>
-          <w:b/>
-        </w:rPr>
-        <w:t xml:space="preserve"> </w:t>
-      </w:r>
-      <w:r>
-        <w:rPr>
-          <w:bCs/>
-          <w:b/>
-        </w:rPr>
-        <w:t xml:space="preserve">en versión vieja:</w:t>
-      </w:r>
-      <w:r>
-        <w:t xml:space="preserve"> </w:t>
-      </w:r>
-      <w:r>
-        <w:t xml:space="preserve">cuando actualizábamos la aplicación, algunos usuarios seguían viendo la versión anterior porque el navegador la había guardado en caché. Lo resolvimos con un Service Worker especial que detecta las cachés antiguas y las elimina automáticamente.</w:t>
+        <w:t xml:space="preserve">despliegue en producción</w:t>
+      </w:r>
+      <w:r>
+        <w:t xml:space="preserve"> </w:t>
+      </w:r>
+      <w:r>
+        <w:t xml:space="preserve">accesible públicamente desde cualquier dispositivo con conexión a internet.</w:t>
       </w:r>
     </w:p>
     <w:p>
@@ -8955,44 +8990,33 @@
         <w:pStyle w:val="Compact"/>
       </w:pPr>
       <w:r>
+        <w:t xml:space="preserve">Un sistema de</w:t>
+      </w:r>
+      <w:r>
+        <w:t xml:space="preserve"> </w:t>
+      </w:r>
+      <w:r>
         <w:rPr>
           <w:bCs/>
           <w:b/>
         </w:rPr>
-        <w:t xml:space="preserve">Diseño demasiado recargado:</w:t>
-      </w:r>
-      <w:r>
-        <w:t xml:space="preserve"> </w:t>
-      </w:r>
-      <w:r>
-        <w:t xml:space="preserve">la segunda versión del diseño resultó visualmente saturada. Hicimos un rediseño completo a la tercera versión, más limpia y legible.</w:t>
-      </w:r>
-    </w:p>
-    <w:p>
-      <w:r>
-        <w:pict>
-          <v:rect style="width:0;height:1.5pt" o:hralign="center" o:hrstd="t" o:hr="t"/>
-        </w:pict>
-      </w:r>
-    </w:p>
-    <w:bookmarkEnd w:id="93"/>
-    <w:bookmarkEnd w:id="94"/>
-    <w:bookmarkStart w:id="99" w:name="conclusiones"/>
-    <w:p>
-      <w:pPr>
-        <w:pStyle w:val="Heading1"/>
-      </w:pPr>
-      <w:r>
-        <w:t xml:space="preserve">11. Conclusiones</w:t>
-      </w:r>
-    </w:p>
-    <w:bookmarkStart w:id="95" w:name="resultados-obtenidos-1"/>
+        <w:t xml:space="preserve">pruebas automáticas</w:t>
+      </w:r>
+      <w:r>
+        <w:t xml:space="preserve"> </w:t>
+      </w:r>
+      <w:r>
+        <w:t xml:space="preserve">que verifica los flujos más importantes, incluida la gestión de reservas concurrentes.</w:t>
+      </w:r>
+    </w:p>
+    <w:bookmarkEnd w:id="95"/>
+    <w:bookmarkStart w:id="96" w:name="problemas-encontrados"/>
     <w:p>
       <w:pPr>
         <w:pStyle w:val="Heading2"/>
       </w:pPr>
       <w:r>
-        <w:t xml:space="preserve">11.1 Resultados obtenidos</w:t>
+        <w:t xml:space="preserve">11.2 Problemas encontrados</w:t>
       </w:r>
     </w:p>
     <w:p>
@@ -9000,7 +9024,7 @@
         <w:pStyle w:val="FirstParagraph"/>
       </w:pPr>
       <w:r>
-        <w:t xml:space="preserve">El proyecto ha producido un sistema completo y funcional:</w:t>
+        <w:t xml:space="preserve">Los retos más importantes que tuvimos que superar:</w:t>
       </w:r>
     </w:p>
     <w:p>
@@ -9012,23 +9036,35 @@
         <w:pStyle w:val="Compact"/>
       </w:pPr>
       <w:r>
-        <w:t xml:space="preserve">Una</w:t>
-      </w:r>
-      <w:r>
-        <w:t xml:space="preserve"> </w:t>
-      </w:r>
-      <w:r>
         <w:rPr>
           <w:bCs/>
           <w:b/>
         </w:rPr>
-        <w:t xml:space="preserve">página web</w:t>
-      </w:r>
-      <w:r>
-        <w:t xml:space="preserve"> </w:t>
-      </w:r>
-      <w:r>
-        <w:t xml:space="preserve">instalable como aplicación de escritorio, con catálogo de 500 productos, gestión completa de reservas, panel de estadísticas, importación y exportación de datos en CSV, e instaladores para Windows.</w:t>
+        <w:t xml:space="preserve">La concurrencia:</w:t>
+      </w:r>
+      <w:r>
+        <w:t xml:space="preserve"> </w:t>
+      </w:r>
+      <w:r>
+        <w:t xml:space="preserve">entender por qué simplemente</w:t>
+      </w:r>
+      <w:r>
+        <w:t xml:space="preserve"> </w:t>
+      </w:r>
+      <w:r>
+        <w:t xml:space="preserve">“</w:t>
+      </w:r>
+      <w:r>
+        <w:t xml:space="preserve">comprobar el stock antes de reservar</w:t>
+      </w:r>
+      <w:r>
+        <w:t xml:space="preserve">”</w:t>
+      </w:r>
+      <w:r>
+        <w:t xml:space="preserve"> </w:t>
+      </w:r>
+      <w:r>
+        <w:t xml:space="preserve">no es suficiente cuando dos usuarios lo hacen al mismo tiempo fue el problema técnico más interesante del proyecto. Requirió estudiar cómo funcionan las transacciones en bases de datos y el concepto de bloqueo pesimista.</w:t>
       </w:r>
     </w:p>
     <w:p>
@@ -9040,23 +9076,17 @@
         <w:pStyle w:val="Compact"/>
       </w:pPr>
       <w:r>
-        <w:t xml:space="preserve">Una</w:t>
-      </w:r>
-      <w:r>
-        <w:t xml:space="preserve"> </w:t>
-      </w:r>
-      <w:r>
         <w:rPr>
           <w:bCs/>
           <w:b/>
         </w:rPr>
-        <w:t xml:space="preserve">aplicación Android nativa</w:t>
-      </w:r>
-      <w:r>
-        <w:t xml:space="preserve"> </w:t>
-      </w:r>
-      <w:r>
-        <w:t xml:space="preserve">que permite al operario gestionar las reservas del almacén desde su móvil, con sesión cifrada y cuatro pantallas funcionales.</w:t>
+        <w:t xml:space="preserve">Iterar el diseño:</w:t>
+      </w:r>
+      <w:r>
+        <w:t xml:space="preserve"> </w:t>
+      </w:r>
+      <w:r>
+        <w:t xml:space="preserve">llegar a un diseño que funcione visualmente llevó más tiempo del esperado. Descartamos dos versiones completas antes de dar con el equilibrio correcto.</w:t>
       </w:r>
     </w:p>
     <w:p>
@@ -9068,23 +9098,17 @@
         <w:pStyle w:val="Compact"/>
       </w:pPr>
       <w:r>
-        <w:t xml:space="preserve">Un</w:t>
-      </w:r>
-      <w:r>
-        <w:t xml:space="preserve"> </w:t>
-      </w:r>
-      <w:r>
         <w:rPr>
           <w:bCs/>
           <w:b/>
         </w:rPr>
-        <w:t xml:space="preserve">despliegue en producción</w:t>
-      </w:r>
-      <w:r>
-        <w:t xml:space="preserve"> </w:t>
-      </w:r>
-      <w:r>
-        <w:t xml:space="preserve">accesible públicamente desde cualquier dispositivo con conexión a internet.</w:t>
+        <w:t xml:space="preserve">Compatibilidad entre máquinas:</w:t>
+      </w:r>
+      <w:r>
+        <w:t xml:space="preserve"> </w:t>
+      </w:r>
+      <w:r>
+        <w:t xml:space="preserve">configurar MySQL de forma que funcione igual en distintos ordenadores (con versiones diferentes, puertos ocupados, etc.) resultó más complicado de lo previsto.</w:t>
       </w:r>
     </w:p>
     <w:p>
@@ -9096,33 +9120,27 @@
         <w:pStyle w:val="Compact"/>
       </w:pPr>
       <w:r>
-        <w:t xml:space="preserve">Un sistema de</w:t>
-      </w:r>
-      <w:r>
-        <w:t xml:space="preserve"> </w:t>
-      </w:r>
-      <w:r>
         <w:rPr>
           <w:bCs/>
           <w:b/>
         </w:rPr>
-        <w:t xml:space="preserve">pruebas automáticas</w:t>
-      </w:r>
-      <w:r>
-        <w:t xml:space="preserve"> </w:t>
-      </w:r>
-      <w:r>
-        <w:t xml:space="preserve">que verifica los flujos más importantes, incluida la gestión de reservas concurrentes.</w:t>
-      </w:r>
-    </w:p>
-    <w:bookmarkEnd w:id="95"/>
-    <w:bookmarkStart w:id="96" w:name="problemas-encontrados"/>
+        <w:t xml:space="preserve">La caché de la PWA:</w:t>
+      </w:r>
+      <w:r>
+        <w:t xml:space="preserve"> </w:t>
+      </w:r>
+      <w:r>
+        <w:t xml:space="preserve">aprendimos que una actualización mal implementada puede dejar a los usuarios atascados en una versión antigua de la aplicación durante días.</w:t>
+      </w:r>
+    </w:p>
+    <w:bookmarkEnd w:id="96"/>
+    <w:bookmarkStart w:id="97" w:name="mejoras-futuras"/>
     <w:p>
       <w:pPr>
         <w:pStyle w:val="Heading2"/>
       </w:pPr>
       <w:r>
-        <w:t xml:space="preserve">11.2 Problemas encontrados</w:t>
+        <w:t xml:space="preserve">11.3 Mejoras futuras</w:t>
       </w:r>
     </w:p>
     <w:p>
@@ -9130,7 +9148,7 @@
         <w:pStyle w:val="FirstParagraph"/>
       </w:pPr>
       <w:r>
-        <w:t xml:space="preserve">Los retos más importantes que tuvimos que superar:</w:t>
+        <w:t xml:space="preserve">Las principales líneas de mejora identificadas para versiones futuras:</w:t>
       </w:r>
     </w:p>
     <w:p>
@@ -9146,31 +9164,13 @@
           <w:bCs/>
           <w:b/>
         </w:rPr>
-        <w:t xml:space="preserve">La concurrencia:</w:t>
-      </w:r>
-      <w:r>
-        <w:t xml:space="preserve"> </w:t>
-      </w:r>
-      <w:r>
-        <w:t xml:space="preserve">entender por qué simplemente</w:t>
-      </w:r>
-      <w:r>
-        <w:t xml:space="preserve"> </w:t>
-      </w:r>
-      <w:r>
-        <w:t xml:space="preserve">“</w:t>
-      </w:r>
-      <w:r>
-        <w:t xml:space="preserve">comprobar el stock antes de reservar</w:t>
-      </w:r>
-      <w:r>
-        <w:t xml:space="preserve">”</w:t>
-      </w:r>
-      <w:r>
-        <w:t xml:space="preserve"> </w:t>
-      </w:r>
-      <w:r>
-        <w:t xml:space="preserve">no es suficiente cuando dos usuarios lo hacen al mismo tiempo fue el problema técnico más interesante del proyecto. Requirió estudiar cómo funcionan las transacciones en bases de datos y el concepto de bloqueo pesimista.</w:t>
+        <w:t xml:space="preserve">App Android mejorada:</w:t>
+      </w:r>
+      <w:r>
+        <w:t xml:space="preserve"> </w:t>
+      </w:r>
+      <w:r>
+        <w:t xml:space="preserve">autenticación biométrica (huella dactilar), funcionamiento sin conexión y escáner de códigos de barras.</w:t>
       </w:r>
     </w:p>
     <w:p>
@@ -9186,13 +9186,13 @@
           <w:bCs/>
           <w:b/>
         </w:rPr>
-        <w:t xml:space="preserve">Iterar el diseño:</w:t>
-      </w:r>
-      <w:r>
-        <w:t xml:space="preserve"> </w:t>
-      </w:r>
-      <w:r>
-        <w:t xml:space="preserve">llegar a un diseño que funcione visualmente llevó más tiempo del esperado. Descartamos dos versiones completas antes de dar con el equilibrio correcto.</w:t>
+        <w:t xml:space="preserve">Accesibilidad completa:</w:t>
+      </w:r>
+      <w:r>
+        <w:t xml:space="preserve"> </w:t>
+      </w:r>
+      <w:r>
+        <w:t xml:space="preserve">cumplir el estándar WCAG AA en todos los elementos de la interfaz.</w:t>
       </w:r>
     </w:p>
     <w:p>
@@ -9208,13 +9208,13 @@
           <w:bCs/>
           <w:b/>
         </w:rPr>
-        <w:t xml:space="preserve">Compatibilidad entre máquinas:</w:t>
-      </w:r>
-      <w:r>
-        <w:t xml:space="preserve"> </w:t>
-      </w:r>
-      <w:r>
-        <w:t xml:space="preserve">configurar MySQL de forma que funcione igual en distintos ordenadores (con versiones diferentes, puertos ocupados, etc.) resultó más complicado de lo previsto.</w:t>
+        <w:t xml:space="preserve">Automatización de pruebas en GitHub:</w:t>
+      </w:r>
+      <w:r>
+        <w:t xml:space="preserve"> </w:t>
+      </w:r>
+      <w:r>
+        <w:t xml:space="preserve">ejecutar los tests automáticamente en cada subida de código, no solo en local.</w:t>
       </w:r>
     </w:p>
     <w:p>
@@ -9230,23 +9230,23 @@
           <w:bCs/>
           <w:b/>
         </w:rPr>
-        <w:t xml:space="preserve">La caché de la PWA:</w:t>
-      </w:r>
-      <w:r>
-        <w:t xml:space="preserve"> </w:t>
-      </w:r>
-      <w:r>
-        <w:t xml:space="preserve">aprendimos que una actualización mal implementada puede dejar a los usuarios atascados en una versión antigua de la aplicación durante días.</w:t>
-      </w:r>
-    </w:p>
-    <w:bookmarkEnd w:id="96"/>
-    <w:bookmarkStart w:id="97" w:name="mejoras-futuras"/>
+        <w:t xml:space="preserve">Funcionalidades adicionales:</w:t>
+      </w:r>
+      <w:r>
+        <w:t xml:space="preserve"> </w:t>
+      </w:r>
+      <w:r>
+        <w:t xml:space="preserve">subida de imágenes de productos, notificaciones push, recuperación de contraseña por email y soporte para múltiples almacenes.</w:t>
+      </w:r>
+    </w:p>
+    <w:bookmarkEnd w:id="97"/>
+    <w:bookmarkStart w:id="98" w:name="valoración-personal"/>
     <w:p>
       <w:pPr>
         <w:pStyle w:val="Heading2"/>
       </w:pPr>
       <w:r>
-        <w:t xml:space="preserve">11.3 Mejoras futuras</w:t>
+        <w:t xml:space="preserve">11.4 Valoración personal</w:t>
       </w:r>
     </w:p>
     <w:p>
@@ -9254,7 +9254,706 @@
         <w:pStyle w:val="FirstParagraph"/>
       </w:pPr>
       <w:r>
-        <w:t xml:space="preserve">Las principales líneas de mejora identificadas para versiones futuras:</w:t>
+        <w:t xml:space="preserve">Este proyecto nos ha permitido conectar todo lo aprendido durante el ciclo en un producto real que resuelve un problema concreto. No ha sido solo aplicar conocimientos: ha sido tomar decisiones con consecuencias reales y aprender de los errores.</w:t>
+      </w:r>
+    </w:p>
+    <w:p>
+      <w:pPr>
+        <w:pStyle w:val="BodyText"/>
+      </w:pPr>
+      <w:r>
+        <w:t xml:space="preserve">Lo más valioso ha sido la práctica de iterar: diseñar, probar, descubrir que no funciona del todo bien y volver a empezar sin desanimarse. También hemos aprendido a trabajar con inteligencia artificial de forma crítica: es una herramienta que multiplica la velocidad, pero que exige más responsabilidad, no menos, porque hay que entender lo que propone para poder validarlo.</w:t>
+      </w:r>
+    </w:p>
+    <w:p>
+      <w:pPr>
+        <w:pStyle w:val="BodyText"/>
+      </w:pPr>
+      <w:r>
+        <w:t xml:space="preserve">Los dos objetivos más ambiciosos del proyecto — publicar el sistema en producción y desarrollar la app Android — están cumplidos. El sistema corre en Railway y el operario puede gestionar las reservas desde su móvil. Queda trabajo por hacer, pero la base es sólida.</w:t>
+      </w:r>
+    </w:p>
+    <w:p>
+      <w:r>
+        <w:pict>
+          <v:rect style="width:0;height:1.5pt" o:hralign="center" o:hrstd="t" o:hr="t"/>
+        </w:pict>
+      </w:r>
+    </w:p>
+    <w:bookmarkEnd w:id="98"/>
+    <w:bookmarkEnd w:id="99"/>
+    <w:bookmarkStart w:id="100" w:name="bibliografía"/>
+    <w:p>
+      <w:pPr>
+        <w:pStyle w:val="Heading1"/>
+      </w:pPr>
+      <w:r>
+        <w:t xml:space="preserve">12. Bibliografía</w:t>
+      </w:r>
+    </w:p>
+    <w:p>
+      <w:pPr>
+        <w:pStyle w:val="FirstParagraph"/>
+      </w:pPr>
+      <w:r>
+        <w:rPr>
+          <w:bCs/>
+          <w:b/>
+        </w:rPr>
+        <w:t xml:space="preserve">Documentación oficial consultada:</w:t>
+      </w:r>
+      <w:r>
+        <w:t xml:space="preserve"> </w:t>
+      </w:r>
+      <w:r>
+        <w:t xml:space="preserve">- Node.js: https://nodejs.org/docs</w:t>
+      </w:r>
+      <w:r>
+        <w:t xml:space="preserve"> </w:t>
+      </w:r>
+      <w:r>
+        <w:t xml:space="preserve">- Express: https://expressjs.com</w:t>
+      </w:r>
+      <w:r>
+        <w:t xml:space="preserve"> </w:t>
+      </w:r>
+      <w:r>
+        <w:t xml:space="preserve">- MySQL 8: https://dev.mysql.com/doc/refman/8.0/en/</w:t>
+      </w:r>
+      <w:r>
+        <w:t xml:space="preserve"> </w:t>
+      </w:r>
+      <w:r>
+        <w:t xml:space="preserve">- MDN Web Docs (referencia HTML, CSS y JavaScript): https://developer.mozilla.org</w:t>
+      </w:r>
+      <w:r>
+        <w:t xml:space="preserve"> </w:t>
+      </w:r>
+      <w:r>
+        <w:t xml:space="preserve">- Jetpack Compose (Android): https://developer.android.com/jetpack/compose</w:t>
+      </w:r>
+      <w:r>
+        <w:t xml:space="preserve"> </w:t>
+      </w:r>
+      <w:r>
+        <w:t xml:space="preserve">- Retrofit (librería de red Android): https://square.github.io/retrofit/</w:t>
+      </w:r>
+      <w:r>
+        <w:t xml:space="preserve"> </w:t>
+      </w:r>
+      <w:r>
+        <w:t xml:space="preserve">- JWT — Introducción a los tokens de acceso: https://jwt.io/introduction</w:t>
+      </w:r>
+    </w:p>
+    <w:p>
+      <w:pPr>
+        <w:pStyle w:val="BodyText"/>
+      </w:pPr>
+      <w:r>
+        <w:rPr>
+          <w:bCs/>
+          <w:b/>
+        </w:rPr>
+        <w:t xml:space="preserve">Libros consultados:</w:t>
+      </w:r>
+      <w:r>
+        <w:t xml:space="preserve"> </w:t>
+      </w:r>
+      <w:r>
+        <w:t xml:space="preserve">- Martin Kleppmann,</w:t>
+      </w:r>
+      <w:r>
+        <w:t xml:space="preserve"> </w:t>
+      </w:r>
+      <w:r>
+        <w:rPr>
+          <w:iCs/>
+          <w:i/>
+        </w:rPr>
+        <w:t xml:space="preserve">Diseño de aplicaciones intensivas en datos</w:t>
+      </w:r>
+      <w:r>
+        <w:t xml:space="preserve"> </w:t>
+      </w:r>
+      <w:r>
+        <w:t xml:space="preserve">— consultado para entender las transacciones y la concurrencia en bases de datos.</w:t>
+      </w:r>
+      <w:r>
+        <w:t xml:space="preserve"> </w:t>
+      </w:r>
+      <w:r>
+        <w:t xml:space="preserve">- Martin Fowler,</w:t>
+      </w:r>
+      <w:r>
+        <w:t xml:space="preserve"> </w:t>
+      </w:r>
+      <w:r>
+        <w:rPr>
+          <w:iCs/>
+          <w:i/>
+        </w:rPr>
+        <w:t xml:space="preserve">Refactoring</w:t>
+      </w:r>
+      <w:r>
+        <w:t xml:space="preserve"> </w:t>
+      </w:r>
+      <w:r>
+        <w:t xml:space="preserve">(2.ª edición) — para mejorar la estructura del código sin cambiar su comportamiento.</w:t>
+      </w:r>
+    </w:p>
+    <w:p>
+      <w:pPr>
+        <w:pStyle w:val="BodyText"/>
+      </w:pPr>
+      <w:r>
+        <w:rPr>
+          <w:bCs/>
+          <w:b/>
+        </w:rPr>
+        <w:t xml:space="preserve">Recursos web:</w:t>
+      </w:r>
+      <w:r>
+        <w:t xml:space="preserve"> </w:t>
+      </w:r>
+      <w:r>
+        <w:t xml:space="preserve">- Railway (documentación de despliegue): https://docs.railway.com</w:t>
+      </w:r>
+      <w:r>
+        <w:t xml:space="preserve"> </w:t>
+      </w:r>
+      <w:r>
+        <w:t xml:space="preserve">- WCAG 2.1 — Guía de accesibilidad web: https://www.w3.org/WAI/WCAG21/quickref/</w:t>
+      </w:r>
+      <w:r>
+        <w:t xml:space="preserve"> </w:t>
+      </w:r>
+      <w:r>
+        <w:t xml:space="preserve">- OWASP Top 10 — Los diez riesgos de seguridad más comunes: https://owasp.org/Top10/</w:t>
+      </w:r>
+    </w:p>
+    <w:p>
+      <w:pPr>
+        <w:pStyle w:val="BodyText"/>
+      </w:pPr>
+      <w:r>
+        <w:rPr>
+          <w:bCs/>
+          <w:b/>
+        </w:rPr>
+        <w:t xml:space="preserve">Herramientas utilizadas:</w:t>
+      </w:r>
+      <w:r>
+        <w:t xml:space="preserve"> </w:t>
+      </w:r>
+      <w:r>
+        <w:t xml:space="preserve">Git, GitHub, Visual Studio Code, MySQL Workbench, Figma, Postman, Vitest, ESLint, Claude Code, GitHub Copilot, Inno Setup.</w:t>
+      </w:r>
+    </w:p>
+    <w:p>
+      <w:r>
+        <w:pict>
+          <v:rect style="width:0;height:1.5pt" o:hralign="center" o:hrstd="t" o:hr="t"/>
+        </w:pict>
+      </w:r>
+    </w:p>
+    <w:bookmarkEnd w:id="100"/>
+    <w:bookmarkStart w:id="108" w:name="anexos"/>
+    <w:p>
+      <w:pPr>
+        <w:pStyle w:val="Heading1"/>
+      </w:pPr>
+      <w:r>
+        <w:t xml:space="preserve">13. Anexos</w:t>
+      </w:r>
+    </w:p>
+    <w:bookmarkStart w:id="101" w:name="anexo-a-manual-de-instalación"/>
+    <w:p>
+      <w:pPr>
+        <w:pStyle w:val="Heading2"/>
+      </w:pPr>
+      <w:r>
+        <w:t xml:space="preserve">Anexo A — Manual de instalación</w:t>
+      </w:r>
+    </w:p>
+    <w:p>
+      <w:pPr>
+        <w:pStyle w:val="FirstParagraph"/>
+      </w:pPr>
+      <w:r>
+        <w:rPr>
+          <w:bCs/>
+          <w:b/>
+        </w:rPr>
+        <w:t xml:space="preserve">Opción 1 — Instalador Windows:</w:t>
+      </w:r>
+      <w:r>
+        <w:t xml:space="preserve"> </w:t>
+      </w:r>
+      <w:r>
+        <w:t xml:space="preserve">Ejecutar el archivo</w:t>
+      </w:r>
+      <w:r>
+        <w:t xml:space="preserve"> </w:t>
+      </w:r>
+      <w:r>
+        <w:rPr>
+          <w:rStyle w:val="VerbatimChar"/>
+        </w:rPr>
+        <w:t xml:space="preserve">Stockly-Setup.exe</w:t>
+      </w:r>
+      <w:r>
+        <w:t xml:space="preserve">. El instalador comprueba si Node.js y MySQL están instalados y los instala si es necesario, crea la base de datos, arranca el servidor y abre la aplicación en el navegador.</w:t>
+      </w:r>
+    </w:p>
+    <w:p>
+      <w:pPr>
+        <w:pStyle w:val="BodyText"/>
+      </w:pPr>
+      <w:r>
+        <w:rPr>
+          <w:bCs/>
+          <w:b/>
+        </w:rPr>
+        <w:t xml:space="preserve">Opción 2 — Instalación manual:</w:t>
+      </w:r>
+      <w:r>
+        <w:t xml:space="preserve"> </w:t>
+      </w:r>
+      <w:r>
+        <w:t xml:space="preserve">1. Clonar el repositorio desde GitHub.</w:t>
+      </w:r>
+      <w:r>
+        <w:t xml:space="preserve"> </w:t>
+      </w:r>
+      <w:r>
+        <w:t xml:space="preserve">2. Ejecutar</w:t>
+      </w:r>
+      <w:r>
+        <w:t xml:space="preserve"> </w:t>
+      </w:r>
+      <w:r>
+        <w:rPr>
+          <w:rStyle w:val="VerbatimChar"/>
+        </w:rPr>
+        <w:t xml:space="preserve">start.bat</w:t>
+      </w:r>
+      <w:r>
+        <w:t xml:space="preserve"> </w:t>
+      </w:r>
+      <w:r>
+        <w:t xml:space="preserve">en Windows o seguir las instrucciones del</w:t>
+      </w:r>
+      <w:r>
+        <w:t xml:space="preserve"> </w:t>
+      </w:r>
+      <w:r>
+        <w:rPr>
+          <w:rStyle w:val="VerbatimChar"/>
+        </w:rPr>
+        <w:t xml:space="preserve">README.md</w:t>
+      </w:r>
+      <w:r>
+        <w:t xml:space="preserve"> </w:t>
+      </w:r>
+      <w:r>
+        <w:t xml:space="preserve">en otros sistemas.</w:t>
+      </w:r>
+      <w:r>
+        <w:t xml:space="preserve"> </w:t>
+      </w:r>
+      <w:r>
+        <w:t xml:space="preserve">3. El script inicializa la base de datos si no existe y arranca el servidor en</w:t>
+      </w:r>
+      <w:r>
+        <w:t xml:space="preserve"> </w:t>
+      </w:r>
+      <w:r>
+        <w:rPr>
+          <w:rStyle w:val="VerbatimChar"/>
+        </w:rPr>
+        <w:t xml:space="preserve">http://localhost:3001</w:t>
+      </w:r>
+      <w:r>
+        <w:t xml:space="preserve">.</w:t>
+      </w:r>
+    </w:p>
+    <w:p>
+      <w:pPr>
+        <w:pStyle w:val="BodyText"/>
+      </w:pPr>
+      <w:r>
+        <w:rPr>
+          <w:bCs/>
+          <w:b/>
+        </w:rPr>
+        <w:t xml:space="preserve">Usuarios de prueba</w:t>
+      </w:r>
+      <w:r>
+        <w:t xml:space="preserve"> </w:t>
+      </w:r>
+      <w:r>
+        <w:t xml:space="preserve">(contraseña para todos:</w:t>
+      </w:r>
+      <w:r>
+        <w:t xml:space="preserve"> </w:t>
+      </w:r>
+      <w:r>
+        <w:rPr>
+          <w:rStyle w:val="VerbatimChar"/>
+        </w:rPr>
+        <w:t xml:space="preserve">password123</w:t>
+      </w:r>
+      <w:r>
+        <w:t xml:space="preserve">):</w:t>
+      </w:r>
+      <w:r>
+        <w:t xml:space="preserve"> </w:t>
+      </w:r>
+      <w:r>
+        <w:t xml:space="preserve">-</w:t>
+      </w:r>
+      <w:r>
+        <w:t xml:space="preserve"> </w:t>
+      </w:r>
+      <w:r>
+        <w:rPr>
+          <w:rStyle w:val="VerbatimChar"/>
+        </w:rPr>
+        <w:t xml:space="preserve">adrian@tfg.local</w:t>
+      </w:r>
+      <w:r>
+        <w:t xml:space="preserve"> </w:t>
+      </w:r>
+      <w:r>
+        <w:t xml:space="preserve">— Administrador</w:t>
+      </w:r>
+      <w:r>
+        <w:t xml:space="preserve"> </w:t>
+      </w:r>
+      <w:r>
+        <w:t xml:space="preserve">-</w:t>
+      </w:r>
+      <w:r>
+        <w:t xml:space="preserve"> </w:t>
+      </w:r>
+      <w:r>
+        <w:rPr>
+          <w:rStyle w:val="VerbatimChar"/>
+        </w:rPr>
+        <w:t xml:space="preserve">laura@tfg.local</w:t>
+      </w:r>
+      <w:r>
+        <w:t xml:space="preserve"> </w:t>
+      </w:r>
+      <w:r>
+        <w:t xml:space="preserve">— Operario</w:t>
+      </w:r>
+      <w:r>
+        <w:t xml:space="preserve"> </w:t>
+      </w:r>
+      <w:r>
+        <w:t xml:space="preserve">-</w:t>
+      </w:r>
+      <w:r>
+        <w:t xml:space="preserve"> </w:t>
+      </w:r>
+      <w:r>
+        <w:rPr>
+          <w:rStyle w:val="VerbatimChar"/>
+        </w:rPr>
+        <w:t xml:space="preserve">marcos@tfg.local</w:t>
+      </w:r>
+      <w:r>
+        <w:t xml:space="preserve"> </w:t>
+      </w:r>
+      <w:r>
+        <w:t xml:space="preserve">— Cliente</w:t>
+      </w:r>
+    </w:p>
+    <w:bookmarkEnd w:id="101"/>
+    <w:bookmarkStart w:id="102" w:name="anexo-b-manual-de-usuario"/>
+    <w:p>
+      <w:pPr>
+        <w:pStyle w:val="Heading2"/>
+      </w:pPr>
+      <w:r>
+        <w:t xml:space="preserve">Anexo B — Manual de usuario</w:t>
+      </w:r>
+    </w:p>
+    <w:p>
+      <w:pPr>
+        <w:pStyle w:val="FirstParagraph"/>
+      </w:pPr>
+      <w:r>
+        <w:rPr>
+          <w:bCs/>
+          <w:b/>
+        </w:rPr>
+        <w:t xml:space="preserve">Como cliente:</w:t>
+      </w:r>
+      <w:r>
+        <w:t xml:space="preserve"> </w:t>
+      </w:r>
+      <w:r>
+        <w:t xml:space="preserve">1. Ir al catálogo de productos.</w:t>
+      </w:r>
+      <w:r>
+        <w:t xml:space="preserve"> </w:t>
+      </w:r>
+      <w:r>
+        <w:t xml:space="preserve">2. Buscar el producto que necesitas y abrirlo.</w:t>
+      </w:r>
+      <w:r>
+        <w:t xml:space="preserve"> </w:t>
+      </w:r>
+      <w:r>
+        <w:t xml:space="preserve">3. Indicar cuántas unidades quieres y pulsar</w:t>
+      </w:r>
+      <w:r>
+        <w:t xml:space="preserve"> </w:t>
+      </w:r>
+      <w:r>
+        <w:t xml:space="preserve">“</w:t>
+      </w:r>
+      <w:r>
+        <w:t xml:space="preserve">Reservar</w:t>
+      </w:r>
+      <w:r>
+        <w:t xml:space="preserve">”</w:t>
+      </w:r>
+      <w:r>
+        <w:t xml:space="preserve">.</w:t>
+      </w:r>
+      <w:r>
+        <w:t xml:space="preserve"> </w:t>
+      </w:r>
+      <w:r>
+        <w:t xml:space="preserve">4. En</w:t>
+      </w:r>
+      <w:r>
+        <w:t xml:space="preserve"> </w:t>
+      </w:r>
+      <w:r>
+        <w:t xml:space="preserve">“</w:t>
+      </w:r>
+      <w:r>
+        <w:t xml:space="preserve">Mis reservas</w:t>
+      </w:r>
+      <w:r>
+        <w:t xml:space="preserve">”</w:t>
+      </w:r>
+      <w:r>
+        <w:t xml:space="preserve"> </w:t>
+      </w:r>
+      <w:r>
+        <w:t xml:space="preserve">puedes ver el estado de tus pedidos.</w:t>
+      </w:r>
+    </w:p>
+    <w:p>
+      <w:pPr>
+        <w:pStyle w:val="BodyText"/>
+      </w:pPr>
+      <w:r>
+        <w:rPr>
+          <w:bCs/>
+          <w:b/>
+        </w:rPr>
+        <w:t xml:space="preserve">Como operario:</w:t>
+      </w:r>
+      <w:r>
+        <w:t xml:space="preserve"> </w:t>
+      </w:r>
+      <w:r>
+        <w:t xml:space="preserve">1. En la pestaña</w:t>
+      </w:r>
+      <w:r>
+        <w:t xml:space="preserve"> </w:t>
+      </w:r>
+      <w:r>
+        <w:t xml:space="preserve">“</w:t>
+      </w:r>
+      <w:r>
+        <w:t xml:space="preserve">Reservas</w:t>
+      </w:r>
+      <w:r>
+        <w:t xml:space="preserve">”</w:t>
+      </w:r>
+      <w:r>
+        <w:t xml:space="preserve"> </w:t>
+      </w:r>
+      <w:r>
+        <w:t xml:space="preserve">verás todos los pedidos pendientes.</w:t>
+      </w:r>
+      <w:r>
+        <w:t xml:space="preserve"> </w:t>
+      </w:r>
+      <w:r>
+        <w:t xml:space="preserve">2. Cuando prepares un pedido, pulsa</w:t>
+      </w:r>
+      <w:r>
+        <w:t xml:space="preserve"> </w:t>
+      </w:r>
+      <w:r>
+        <w:t xml:space="preserve">“</w:t>
+      </w:r>
+      <w:r>
+        <w:t xml:space="preserve">Confirmar</w:t>
+      </w:r>
+      <w:r>
+        <w:t xml:space="preserve">”</w:t>
+      </w:r>
+      <w:r>
+        <w:t xml:space="preserve">.</w:t>
+      </w:r>
+      <w:r>
+        <w:t xml:space="preserve"> </w:t>
+      </w:r>
+      <w:r>
+        <w:t xml:space="preserve">3. Cuando lo entregues al cliente, pulsa</w:t>
+      </w:r>
+      <w:r>
+        <w:t xml:space="preserve"> </w:t>
+      </w:r>
+      <w:r>
+        <w:t xml:space="preserve">“</w:t>
+      </w:r>
+      <w:r>
+        <w:t xml:space="preserve">Entregar</w:t>
+      </w:r>
+      <w:r>
+        <w:t xml:space="preserve">”</w:t>
+      </w:r>
+      <w:r>
+        <w:t xml:space="preserve"> </w:t>
+      </w:r>
+      <w:r>
+        <w:t xml:space="preserve">e imprime el albarán si es necesario.</w:t>
+      </w:r>
+      <w:r>
+        <w:t xml:space="preserve"> </w:t>
+      </w:r>
+      <w:r>
+        <w:t xml:space="preserve">4. Si hay algún problema con el pedido, usa el botón de incidencia para registrarlo.</w:t>
+      </w:r>
+    </w:p>
+    <w:p>
+      <w:pPr>
+        <w:pStyle w:val="BodyText"/>
+      </w:pPr>
+      <w:r>
+        <w:rPr>
+          <w:bCs/>
+          <w:b/>
+        </w:rPr>
+        <w:t xml:space="preserve">Como administrador:</w:t>
+      </w:r>
+      <w:r>
+        <w:t xml:space="preserve"> </w:t>
+      </w:r>
+      <w:r>
+        <w:t xml:space="preserve">- En</w:t>
+      </w:r>
+      <w:r>
+        <w:t xml:space="preserve"> </w:t>
+      </w:r>
+      <w:r>
+        <w:t xml:space="preserve">“</w:t>
+      </w:r>
+      <w:r>
+        <w:t xml:space="preserve">Inventario</w:t>
+      </w:r>
+      <w:r>
+        <w:t xml:space="preserve">”</w:t>
+      </w:r>
+      <w:r>
+        <w:t xml:space="preserve"> </w:t>
+      </w:r>
+      <w:r>
+        <w:t xml:space="preserve">puedes crear, editar y eliminar productos.</w:t>
+      </w:r>
+      <w:r>
+        <w:t xml:space="preserve"> </w:t>
+      </w:r>
+      <w:r>
+        <w:t xml:space="preserve">- En</w:t>
+      </w:r>
+      <w:r>
+        <w:t xml:space="preserve"> </w:t>
+      </w:r>
+      <w:r>
+        <w:t xml:space="preserve">“</w:t>
+      </w:r>
+      <w:r>
+        <w:t xml:space="preserve">Dashboard</w:t>
+      </w:r>
+      <w:r>
+        <w:t xml:space="preserve">”</w:t>
+      </w:r>
+      <w:r>
+        <w:t xml:space="preserve"> </w:t>
+      </w:r>
+      <w:r>
+        <w:t xml:space="preserve">tienes un resumen del estado del almacén.</w:t>
+      </w:r>
+      <w:r>
+        <w:t xml:space="preserve"> </w:t>
+      </w:r>
+      <w:r>
+        <w:t xml:space="preserve">- En</w:t>
+      </w:r>
+      <w:r>
+        <w:t xml:space="preserve"> </w:t>
+      </w:r>
+      <w:r>
+        <w:t xml:space="preserve">“</w:t>
+      </w:r>
+      <w:r>
+        <w:t xml:space="preserve">Usuarios</w:t>
+      </w:r>
+      <w:r>
+        <w:t xml:space="preserve">”</w:t>
+      </w:r>
+      <w:r>
+        <w:t xml:space="preserve"> </w:t>
+      </w:r>
+      <w:r>
+        <w:t xml:space="preserve">puedes gestionar las cuentas del equipo.</w:t>
+      </w:r>
+      <w:r>
+        <w:t xml:space="preserve"> </w:t>
+      </w:r>
+      <w:r>
+        <w:t xml:space="preserve">- Puedes importar productos en lote desde un archivo CSV.</w:t>
+      </w:r>
+    </w:p>
+    <w:p>
+      <w:pPr>
+        <w:pStyle w:val="BodyText"/>
+      </w:pPr>
+      <w:r>
+        <w:t xml:space="preserve">Manual detallado con capturas paso a paso disponible en</w:t>
+      </w:r>
+      <w:r>
+        <w:t xml:space="preserve"> </w:t>
+      </w:r>
+      <w:r>
+        <w:rPr>
+          <w:rStyle w:val="VerbatimChar"/>
+        </w:rPr>
+        <w:t xml:space="preserve">docs/manual-usuario.md</w:t>
+      </w:r>
+      <w:r>
+        <w:t xml:space="preserve">.</w:t>
+      </w:r>
+    </w:p>
+    <w:bookmarkEnd w:id="102"/>
+    <w:bookmarkStart w:id="103" w:name="anexo-c-enlaces"/>
+    <w:p>
+      <w:pPr>
+        <w:pStyle w:val="Heading2"/>
+      </w:pPr>
+      <w:r>
+        <w:t xml:space="preserve">Anexo C — Enlaces</w:t>
       </w:r>
     </w:p>
     <w:p>
@@ -9270,13 +9969,13 @@
           <w:bCs/>
           <w:b/>
         </w:rPr>
-        <w:t xml:space="preserve">App Android mejorada:</w:t>
-      </w:r>
-      <w:r>
-        <w:t xml:space="preserve"> </w:t>
-      </w:r>
-      <w:r>
-        <w:t xml:space="preserve">autenticación biométrica (huella dactilar), funcionamiento sin conexión y escáner de códigos de barras.</w:t>
+        <w:t xml:space="preserve">Código fuente en GitHub:</w:t>
+      </w:r>
+      <w:r>
+        <w:t xml:space="preserve"> </w:t>
+      </w:r>
+      <w:r>
+        <w:t xml:space="preserve">https://github.com/husslesnake/TFGDAM</w:t>
       </w:r>
     </w:p>
     <w:p>
@@ -9292,13 +9991,13 @@
           <w:bCs/>
           <w:b/>
         </w:rPr>
-        <w:t xml:space="preserve">Accesibilidad completa:</w:t>
-      </w:r>
-      <w:r>
-        <w:t xml:space="preserve"> </w:t>
-      </w:r>
-      <w:r>
-        <w:t xml:space="preserve">cumplir el estándar WCAG AA en todos los elementos de la interfaz.</w:t>
+        <w:t xml:space="preserve">Aplicación web en producción:</w:t>
+      </w:r>
+      <w:r>
+        <w:t xml:space="preserve"> </w:t>
+      </w:r>
+      <w:r>
+        <w:t xml:space="preserve">https://tfgdam-production.up.railway.app/</w:t>
       </w:r>
     </w:p>
     <w:p>
@@ -9314,13 +10013,13 @@
           <w:bCs/>
           <w:b/>
         </w:rPr>
-        <w:t xml:space="preserve">Automatización de pruebas en GitHub:</w:t>
-      </w:r>
-      <w:r>
-        <w:t xml:space="preserve"> </w:t>
-      </w:r>
-      <w:r>
-        <w:t xml:space="preserve">ejecutar los tests automáticamente en cada subida de código, no solo en local.</w:t>
+        <w:t xml:space="preserve">Documentación interactiva (Swagger UI):</w:t>
+      </w:r>
+      <w:r>
+        <w:t xml:space="preserve"> </w:t>
+      </w:r>
+      <w:r>
+        <w:t xml:space="preserve">https://tfgdam-production.up.railway.app/api/docs</w:t>
       </w:r>
     </w:p>
     <w:p>
@@ -9328,811 +10027,6 @@
         <w:numPr>
           <w:ilvl w:val="0"/>
           <w:numId w:val="1027"/>
-        </w:numPr>
-        <w:pStyle w:val="Compact"/>
-      </w:pPr>
-      <w:r>
-        <w:rPr>
-          <w:bCs/>
-          <w:b/>
-        </w:rPr>
-        <w:t xml:space="preserve">Funcionalidades adicionales:</w:t>
-      </w:r>
-      <w:r>
-        <w:t xml:space="preserve"> </w:t>
-      </w:r>
-      <w:r>
-        <w:t xml:space="preserve">subida de imágenes de productos, notificaciones push, recuperación de contraseña por email y soporte para múltiples almacenes.</w:t>
-      </w:r>
-    </w:p>
-    <w:bookmarkEnd w:id="97"/>
-    <w:bookmarkStart w:id="98" w:name="valoración-personal"/>
-    <w:p>
-      <w:pPr>
-        <w:pStyle w:val="Heading2"/>
-      </w:pPr>
-      <w:r>
-        <w:t xml:space="preserve">11.4 Valoración personal</w:t>
-      </w:r>
-    </w:p>
-    <w:p>
-      <w:pPr>
-        <w:pStyle w:val="FirstParagraph"/>
-      </w:pPr>
-      <w:r>
-        <w:t xml:space="preserve">Este proyecto nos ha permitido conectar todo lo aprendido durante el ciclo en un producto real que resuelve un problema concreto. No ha sido solo aplicar conocimientos: ha sido tomar decisiones con consecuencias reales y aprender de los errores.</w:t>
-      </w:r>
-    </w:p>
-    <w:p>
-      <w:pPr>
-        <w:pStyle w:val="BodyText"/>
-      </w:pPr>
-      <w:r>
-        <w:t xml:space="preserve">Lo más valioso ha sido la práctica de iterar: diseñar, probar, descubrir que no funciona del todo bien y volver a empezar sin desanimarse. También hemos aprendido a trabajar con inteligencia artificial de forma crítica: es una herramienta que multiplica la velocidad, pero que exige más responsabilidad, no menos, porque hay que entender lo que propone para poder validarlo.</w:t>
-      </w:r>
-    </w:p>
-    <w:p>
-      <w:pPr>
-        <w:pStyle w:val="BodyText"/>
-      </w:pPr>
-      <w:r>
-        <w:t xml:space="preserve">Los dos objetivos más ambiciosos del proyecto — publicar el sistema en producción y desarrollar la app Android — están cumplidos. El sistema corre en Railway y el operario puede gestionar las reservas desde su móvil. Queda trabajo por hacer, pero la base es sólida.</w:t>
-      </w:r>
-    </w:p>
-    <w:p>
-      <w:r>
-        <w:pict>
-          <v:rect style="width:0;height:1.5pt" o:hralign="center" o:hrstd="t" o:hr="t"/>
-        </w:pict>
-      </w:r>
-    </w:p>
-    <w:bookmarkEnd w:id="98"/>
-    <w:bookmarkEnd w:id="99"/>
-    <w:bookmarkStart w:id="100" w:name="bibliografía"/>
-    <w:p>
-      <w:pPr>
-        <w:pStyle w:val="Heading1"/>
-      </w:pPr>
-      <w:r>
-        <w:t xml:space="preserve">12. Bibliografía</w:t>
-      </w:r>
-    </w:p>
-    <w:p>
-      <w:pPr>
-        <w:pStyle w:val="FirstParagraph"/>
-      </w:pPr>
-      <w:r>
-        <w:rPr>
-          <w:bCs/>
-          <w:b/>
-        </w:rPr>
-        <w:t xml:space="preserve">Documentación oficial consultada:</w:t>
-      </w:r>
-      <w:r>
-        <w:t xml:space="preserve"> </w:t>
-      </w:r>
-      <w:r>
-        <w:t xml:space="preserve">- Node.js: https://nodejs.org/docs</w:t>
-      </w:r>
-      <w:r>
-        <w:t xml:space="preserve"> </w:t>
-      </w:r>
-      <w:r>
-        <w:t xml:space="preserve">- Express: https://expressjs.com</w:t>
-      </w:r>
-      <w:r>
-        <w:t xml:space="preserve"> </w:t>
-      </w:r>
-      <w:r>
-        <w:t xml:space="preserve">- MySQL 8: https://dev.mysql.com/doc/refman/8.0/en/</w:t>
-      </w:r>
-      <w:r>
-        <w:t xml:space="preserve"> </w:t>
-      </w:r>
-      <w:r>
-        <w:t xml:space="preserve">- MDN Web Docs (referencia HTML, CSS y JavaScript): https://developer.mozilla.org</w:t>
-      </w:r>
-      <w:r>
-        <w:t xml:space="preserve"> </w:t>
-      </w:r>
-      <w:r>
-        <w:t xml:space="preserve">- Jetpack Compose (Android): https://developer.android.com/jetpack/compose</w:t>
-      </w:r>
-      <w:r>
-        <w:t xml:space="preserve"> </w:t>
-      </w:r>
-      <w:r>
-        <w:t xml:space="preserve">- Retrofit (librería de red Android): https://square.github.io/retrofit/</w:t>
-      </w:r>
-      <w:r>
-        <w:t xml:space="preserve"> </w:t>
-      </w:r>
-      <w:r>
-        <w:t xml:space="preserve">- JWT — Introducción a los tokens de acceso: https://jwt.io/introduction</w:t>
-      </w:r>
-    </w:p>
-    <w:p>
-      <w:pPr>
-        <w:pStyle w:val="BodyText"/>
-      </w:pPr>
-      <w:r>
-        <w:rPr>
-          <w:bCs/>
-          <w:b/>
-        </w:rPr>
-        <w:t xml:space="preserve">Libros consultados:</w:t>
-      </w:r>
-      <w:r>
-        <w:t xml:space="preserve"> </w:t>
-      </w:r>
-      <w:r>
-        <w:t xml:space="preserve">- Martin Kleppmann,</w:t>
-      </w:r>
-      <w:r>
-        <w:t xml:space="preserve"> </w:t>
-      </w:r>
-      <w:r>
-        <w:rPr>
-          <w:iCs/>
-          <w:i/>
-        </w:rPr>
-        <w:t xml:space="preserve">Diseño de aplicaciones intensivas en datos</w:t>
-      </w:r>
-      <w:r>
-        <w:t xml:space="preserve"> </w:t>
-      </w:r>
-      <w:r>
-        <w:t xml:space="preserve">— consultado para entender las transacciones y la concurrencia en bases de datos.</w:t>
-      </w:r>
-      <w:r>
-        <w:t xml:space="preserve"> </w:t>
-      </w:r>
-      <w:r>
-        <w:t xml:space="preserve">- Martin Fowler,</w:t>
-      </w:r>
-      <w:r>
-        <w:t xml:space="preserve"> </w:t>
-      </w:r>
-      <w:r>
-        <w:rPr>
-          <w:iCs/>
-          <w:i/>
-        </w:rPr>
-        <w:t xml:space="preserve">Refactoring</w:t>
-      </w:r>
-      <w:r>
-        <w:t xml:space="preserve"> </w:t>
-      </w:r>
-      <w:r>
-        <w:t xml:space="preserve">(2.ª edición) — para mejorar la estructura del código sin cambiar su comportamiento.</w:t>
-      </w:r>
-    </w:p>
-    <w:p>
-      <w:pPr>
-        <w:pStyle w:val="BodyText"/>
-      </w:pPr>
-      <w:r>
-        <w:rPr>
-          <w:bCs/>
-          <w:b/>
-        </w:rPr>
-        <w:t xml:space="preserve">Recursos web:</w:t>
-      </w:r>
-      <w:r>
-        <w:t xml:space="preserve"> </w:t>
-      </w:r>
-      <w:r>
-        <w:t xml:space="preserve">- Railway (documentación de despliegue): https://docs.railway.com</w:t>
-      </w:r>
-      <w:r>
-        <w:t xml:space="preserve"> </w:t>
-      </w:r>
-      <w:r>
-        <w:t xml:space="preserve">- WCAG 2.1 — Guía de accesibilidad web: https://www.w3.org/WAI/WCAG21/quickref/</w:t>
-      </w:r>
-      <w:r>
-        <w:t xml:space="preserve"> </w:t>
-      </w:r>
-      <w:r>
-        <w:t xml:space="preserve">- OWASP Top 10 — Los diez riesgos de seguridad más comunes: https://owasp.org/Top10/</w:t>
-      </w:r>
-    </w:p>
-    <w:p>
-      <w:pPr>
-        <w:pStyle w:val="BodyText"/>
-      </w:pPr>
-      <w:r>
-        <w:rPr>
-          <w:bCs/>
-          <w:b/>
-        </w:rPr>
-        <w:t xml:space="preserve">Herramientas utilizadas:</w:t>
-      </w:r>
-      <w:r>
-        <w:t xml:space="preserve"> </w:t>
-      </w:r>
-      <w:r>
-        <w:t xml:space="preserve">Git, GitHub, Visual Studio Code, MySQL Workbench, Figma, Postman, Vitest, ESLint, Claude Code, GitHub Copilot, Inno Setup.</w:t>
-      </w:r>
-    </w:p>
-    <w:p>
-      <w:r>
-        <w:pict>
-          <v:rect style="width:0;height:1.5pt" o:hralign="center" o:hrstd="t" o:hr="t"/>
-        </w:pict>
-      </w:r>
-    </w:p>
-    <w:bookmarkEnd w:id="100"/>
-    <w:bookmarkStart w:id="108" w:name="anexos"/>
-    <w:p>
-      <w:pPr>
-        <w:pStyle w:val="Heading1"/>
-      </w:pPr>
-      <w:r>
-        <w:t xml:space="preserve">13. Anexos</w:t>
-      </w:r>
-    </w:p>
-    <w:bookmarkStart w:id="101" w:name="anexo-a-manual-de-instalación"/>
-    <w:p>
-      <w:pPr>
-        <w:pStyle w:val="Heading2"/>
-      </w:pPr>
-      <w:r>
-        <w:t xml:space="preserve">Anexo A — Manual de instalación</w:t>
-      </w:r>
-    </w:p>
-    <w:p>
-      <w:pPr>
-        <w:pStyle w:val="FirstParagraph"/>
-      </w:pPr>
-      <w:r>
-        <w:rPr>
-          <w:bCs/>
-          <w:b/>
-        </w:rPr>
-        <w:t xml:space="preserve">Opción 1 — Instalador Windows:</w:t>
-      </w:r>
-      <w:r>
-        <w:t xml:space="preserve"> </w:t>
-      </w:r>
-      <w:r>
-        <w:t xml:space="preserve">Ejecutar el archivo</w:t>
-      </w:r>
-      <w:r>
-        <w:t xml:space="preserve"> </w:t>
-      </w:r>
-      <w:r>
-        <w:rPr>
-          <w:rStyle w:val="VerbatimChar"/>
-        </w:rPr>
-        <w:t xml:space="preserve">Stockly-Setup.exe</w:t>
-      </w:r>
-      <w:r>
-        <w:t xml:space="preserve">. El instalador comprueba si Node.js y MySQL están instalados y los instala si es necesario, crea la base de datos, arranca el servidor y abre la aplicación en el navegador.</w:t>
-      </w:r>
-    </w:p>
-    <w:p>
-      <w:pPr>
-        <w:pStyle w:val="BodyText"/>
-      </w:pPr>
-      <w:r>
-        <w:rPr>
-          <w:bCs/>
-          <w:b/>
-        </w:rPr>
-        <w:t xml:space="preserve">Opción 2 — Instalación manual:</w:t>
-      </w:r>
-      <w:r>
-        <w:t xml:space="preserve"> </w:t>
-      </w:r>
-      <w:r>
-        <w:t xml:space="preserve">1. Clonar el repositorio desde GitHub.</w:t>
-      </w:r>
-      <w:r>
-        <w:t xml:space="preserve"> </w:t>
-      </w:r>
-      <w:r>
-        <w:t xml:space="preserve">2. Ejecutar</w:t>
-      </w:r>
-      <w:r>
-        <w:t xml:space="preserve"> </w:t>
-      </w:r>
-      <w:r>
-        <w:rPr>
-          <w:rStyle w:val="VerbatimChar"/>
-        </w:rPr>
-        <w:t xml:space="preserve">start.bat</w:t>
-      </w:r>
-      <w:r>
-        <w:t xml:space="preserve"> </w:t>
-      </w:r>
-      <w:r>
-        <w:t xml:space="preserve">en Windows o seguir las instrucciones del</w:t>
-      </w:r>
-      <w:r>
-        <w:t xml:space="preserve"> </w:t>
-      </w:r>
-      <w:r>
-        <w:rPr>
-          <w:rStyle w:val="VerbatimChar"/>
-        </w:rPr>
-        <w:t xml:space="preserve">README.md</w:t>
-      </w:r>
-      <w:r>
-        <w:t xml:space="preserve"> </w:t>
-      </w:r>
-      <w:r>
-        <w:t xml:space="preserve">en otros sistemas.</w:t>
-      </w:r>
-      <w:r>
-        <w:t xml:space="preserve"> </w:t>
-      </w:r>
-      <w:r>
-        <w:t xml:space="preserve">3. El script inicializa la base de datos si no existe y arranca el servidor en</w:t>
-      </w:r>
-      <w:r>
-        <w:t xml:space="preserve"> </w:t>
-      </w:r>
-      <w:r>
-        <w:rPr>
-          <w:rStyle w:val="VerbatimChar"/>
-        </w:rPr>
-        <w:t xml:space="preserve">http://localhost:3001</w:t>
-      </w:r>
-      <w:r>
-        <w:t xml:space="preserve">.</w:t>
-      </w:r>
-    </w:p>
-    <w:p>
-      <w:pPr>
-        <w:pStyle w:val="BodyText"/>
-      </w:pPr>
-      <w:r>
-        <w:rPr>
-          <w:bCs/>
-          <w:b/>
-        </w:rPr>
-        <w:t xml:space="preserve">Usuarios de prueba</w:t>
-      </w:r>
-      <w:r>
-        <w:t xml:space="preserve"> </w:t>
-      </w:r>
-      <w:r>
-        <w:t xml:space="preserve">(contraseña para todos:</w:t>
-      </w:r>
-      <w:r>
-        <w:t xml:space="preserve"> </w:t>
-      </w:r>
-      <w:r>
-        <w:rPr>
-          <w:rStyle w:val="VerbatimChar"/>
-        </w:rPr>
-        <w:t xml:space="preserve">password123</w:t>
-      </w:r>
-      <w:r>
-        <w:t xml:space="preserve">):</w:t>
-      </w:r>
-      <w:r>
-        <w:t xml:space="preserve"> </w:t>
-      </w:r>
-      <w:r>
-        <w:t xml:space="preserve">-</w:t>
-      </w:r>
-      <w:r>
-        <w:t xml:space="preserve"> </w:t>
-      </w:r>
-      <w:r>
-        <w:rPr>
-          <w:rStyle w:val="VerbatimChar"/>
-        </w:rPr>
-        <w:t xml:space="preserve">adrian@tfg.local</w:t>
-      </w:r>
-      <w:r>
-        <w:t xml:space="preserve"> </w:t>
-      </w:r>
-      <w:r>
-        <w:t xml:space="preserve">— Administrador</w:t>
-      </w:r>
-      <w:r>
-        <w:t xml:space="preserve"> </w:t>
-      </w:r>
-      <w:r>
-        <w:t xml:space="preserve">-</w:t>
-      </w:r>
-      <w:r>
-        <w:t xml:space="preserve"> </w:t>
-      </w:r>
-      <w:r>
-        <w:rPr>
-          <w:rStyle w:val="VerbatimChar"/>
-        </w:rPr>
-        <w:t xml:space="preserve">laura@tfg.local</w:t>
-      </w:r>
-      <w:r>
-        <w:t xml:space="preserve"> </w:t>
-      </w:r>
-      <w:r>
-        <w:t xml:space="preserve">— Operario</w:t>
-      </w:r>
-      <w:r>
-        <w:t xml:space="preserve"> </w:t>
-      </w:r>
-      <w:r>
-        <w:t xml:space="preserve">-</w:t>
-      </w:r>
-      <w:r>
-        <w:t xml:space="preserve"> </w:t>
-      </w:r>
-      <w:r>
-        <w:rPr>
-          <w:rStyle w:val="VerbatimChar"/>
-        </w:rPr>
-        <w:t xml:space="preserve">marcos@tfg.local</w:t>
-      </w:r>
-      <w:r>
-        <w:t xml:space="preserve"> </w:t>
-      </w:r>
-      <w:r>
-        <w:t xml:space="preserve">— Cliente</w:t>
-      </w:r>
-    </w:p>
-    <w:bookmarkEnd w:id="101"/>
-    <w:bookmarkStart w:id="102" w:name="anexo-b-manual-de-usuario"/>
-    <w:p>
-      <w:pPr>
-        <w:pStyle w:val="Heading2"/>
-      </w:pPr>
-      <w:r>
-        <w:t xml:space="preserve">Anexo B — Manual de usuario</w:t>
-      </w:r>
-    </w:p>
-    <w:p>
-      <w:pPr>
-        <w:pStyle w:val="FirstParagraph"/>
-      </w:pPr>
-      <w:r>
-        <w:rPr>
-          <w:bCs/>
-          <w:b/>
-        </w:rPr>
-        <w:t xml:space="preserve">Como cliente:</w:t>
-      </w:r>
-      <w:r>
-        <w:t xml:space="preserve"> </w:t>
-      </w:r>
-      <w:r>
-        <w:t xml:space="preserve">1. Ir al catálogo de productos.</w:t>
-      </w:r>
-      <w:r>
-        <w:t xml:space="preserve"> </w:t>
-      </w:r>
-      <w:r>
-        <w:t xml:space="preserve">2. Buscar el producto que necesitas y abrirlo.</w:t>
-      </w:r>
-      <w:r>
-        <w:t xml:space="preserve"> </w:t>
-      </w:r>
-      <w:r>
-        <w:t xml:space="preserve">3. Indicar cuántas unidades quieres y pulsar</w:t>
-      </w:r>
-      <w:r>
-        <w:t xml:space="preserve"> </w:t>
-      </w:r>
-      <w:r>
-        <w:t xml:space="preserve">“</w:t>
-      </w:r>
-      <w:r>
-        <w:t xml:space="preserve">Reservar</w:t>
-      </w:r>
-      <w:r>
-        <w:t xml:space="preserve">”</w:t>
-      </w:r>
-      <w:r>
-        <w:t xml:space="preserve">.</w:t>
-      </w:r>
-      <w:r>
-        <w:t xml:space="preserve"> </w:t>
-      </w:r>
-      <w:r>
-        <w:t xml:space="preserve">4. En</w:t>
-      </w:r>
-      <w:r>
-        <w:t xml:space="preserve"> </w:t>
-      </w:r>
-      <w:r>
-        <w:t xml:space="preserve">“</w:t>
-      </w:r>
-      <w:r>
-        <w:t xml:space="preserve">Mis reservas</w:t>
-      </w:r>
-      <w:r>
-        <w:t xml:space="preserve">”</w:t>
-      </w:r>
-      <w:r>
-        <w:t xml:space="preserve"> </w:t>
-      </w:r>
-      <w:r>
-        <w:t xml:space="preserve">puedes ver el estado de tus pedidos.</w:t>
-      </w:r>
-    </w:p>
-    <w:p>
-      <w:pPr>
-        <w:pStyle w:val="BodyText"/>
-      </w:pPr>
-      <w:r>
-        <w:rPr>
-          <w:bCs/>
-          <w:b/>
-        </w:rPr>
-        <w:t xml:space="preserve">Como operario:</w:t>
-      </w:r>
-      <w:r>
-        <w:t xml:space="preserve"> </w:t>
-      </w:r>
-      <w:r>
-        <w:t xml:space="preserve">1. En la pestaña</w:t>
-      </w:r>
-      <w:r>
-        <w:t xml:space="preserve"> </w:t>
-      </w:r>
-      <w:r>
-        <w:t xml:space="preserve">“</w:t>
-      </w:r>
-      <w:r>
-        <w:t xml:space="preserve">Reservas</w:t>
-      </w:r>
-      <w:r>
-        <w:t xml:space="preserve">”</w:t>
-      </w:r>
-      <w:r>
-        <w:t xml:space="preserve"> </w:t>
-      </w:r>
-      <w:r>
-        <w:t xml:space="preserve">verás todos los pedidos pendientes.</w:t>
-      </w:r>
-      <w:r>
-        <w:t xml:space="preserve"> </w:t>
-      </w:r>
-      <w:r>
-        <w:t xml:space="preserve">2. Cuando prepares un pedido, pulsa</w:t>
-      </w:r>
-      <w:r>
-        <w:t xml:space="preserve"> </w:t>
-      </w:r>
-      <w:r>
-        <w:t xml:space="preserve">“</w:t>
-      </w:r>
-      <w:r>
-        <w:t xml:space="preserve">Confirmar</w:t>
-      </w:r>
-      <w:r>
-        <w:t xml:space="preserve">”</w:t>
-      </w:r>
-      <w:r>
-        <w:t xml:space="preserve">.</w:t>
-      </w:r>
-      <w:r>
-        <w:t xml:space="preserve"> </w:t>
-      </w:r>
-      <w:r>
-        <w:t xml:space="preserve">3. Cuando lo entregues al cliente, pulsa</w:t>
-      </w:r>
-      <w:r>
-        <w:t xml:space="preserve"> </w:t>
-      </w:r>
-      <w:r>
-        <w:t xml:space="preserve">“</w:t>
-      </w:r>
-      <w:r>
-        <w:t xml:space="preserve">Entregar</w:t>
-      </w:r>
-      <w:r>
-        <w:t xml:space="preserve">”</w:t>
-      </w:r>
-      <w:r>
-        <w:t xml:space="preserve"> </w:t>
-      </w:r>
-      <w:r>
-        <w:t xml:space="preserve">e imprime el albarán si es necesario.</w:t>
-      </w:r>
-      <w:r>
-        <w:t xml:space="preserve"> </w:t>
-      </w:r>
-      <w:r>
-        <w:t xml:space="preserve">4. Si hay algún problema con el pedido, usa el botón de incidencia para registrarlo.</w:t>
-      </w:r>
-    </w:p>
-    <w:p>
-      <w:pPr>
-        <w:pStyle w:val="BodyText"/>
-      </w:pPr>
-      <w:r>
-        <w:rPr>
-          <w:bCs/>
-          <w:b/>
-        </w:rPr>
-        <w:t xml:space="preserve">Como administrador:</w:t>
-      </w:r>
-      <w:r>
-        <w:t xml:space="preserve"> </w:t>
-      </w:r>
-      <w:r>
-        <w:t xml:space="preserve">- En</w:t>
-      </w:r>
-      <w:r>
-        <w:t xml:space="preserve"> </w:t>
-      </w:r>
-      <w:r>
-        <w:t xml:space="preserve">“</w:t>
-      </w:r>
-      <w:r>
-        <w:t xml:space="preserve">Inventario</w:t>
-      </w:r>
-      <w:r>
-        <w:t xml:space="preserve">”</w:t>
-      </w:r>
-      <w:r>
-        <w:t xml:space="preserve"> </w:t>
-      </w:r>
-      <w:r>
-        <w:t xml:space="preserve">puedes crear, editar y eliminar productos.</w:t>
-      </w:r>
-      <w:r>
-        <w:t xml:space="preserve"> </w:t>
-      </w:r>
-      <w:r>
-        <w:t xml:space="preserve">- En</w:t>
-      </w:r>
-      <w:r>
-        <w:t xml:space="preserve"> </w:t>
-      </w:r>
-      <w:r>
-        <w:t xml:space="preserve">“</w:t>
-      </w:r>
-      <w:r>
-        <w:t xml:space="preserve">Dashboard</w:t>
-      </w:r>
-      <w:r>
-        <w:t xml:space="preserve">”</w:t>
-      </w:r>
-      <w:r>
-        <w:t xml:space="preserve"> </w:t>
-      </w:r>
-      <w:r>
-        <w:t xml:space="preserve">tienes un resumen del estado del almacén.</w:t>
-      </w:r>
-      <w:r>
-        <w:t xml:space="preserve"> </w:t>
-      </w:r>
-      <w:r>
-        <w:t xml:space="preserve">- En</w:t>
-      </w:r>
-      <w:r>
-        <w:t xml:space="preserve"> </w:t>
-      </w:r>
-      <w:r>
-        <w:t xml:space="preserve">“</w:t>
-      </w:r>
-      <w:r>
-        <w:t xml:space="preserve">Usuarios</w:t>
-      </w:r>
-      <w:r>
-        <w:t xml:space="preserve">”</w:t>
-      </w:r>
-      <w:r>
-        <w:t xml:space="preserve"> </w:t>
-      </w:r>
-      <w:r>
-        <w:t xml:space="preserve">puedes gestionar las cuentas del equipo.</w:t>
-      </w:r>
-      <w:r>
-        <w:t xml:space="preserve"> </w:t>
-      </w:r>
-      <w:r>
-        <w:t xml:space="preserve">- Puedes importar productos en lote desde un archivo CSV.</w:t>
-      </w:r>
-    </w:p>
-    <w:p>
-      <w:pPr>
-        <w:pStyle w:val="BodyText"/>
-      </w:pPr>
-      <w:r>
-        <w:t xml:space="preserve">Manual detallado con capturas paso a paso disponible en</w:t>
-      </w:r>
-      <w:r>
-        <w:t xml:space="preserve"> </w:t>
-      </w:r>
-      <w:r>
-        <w:rPr>
-          <w:rStyle w:val="VerbatimChar"/>
-        </w:rPr>
-        <w:t xml:space="preserve">docs/manual-usuario.md</w:t>
-      </w:r>
-      <w:r>
-        <w:t xml:space="preserve">.</w:t>
-      </w:r>
-    </w:p>
-    <w:bookmarkEnd w:id="102"/>
-    <w:bookmarkStart w:id="103" w:name="anexo-c-enlaces"/>
-    <w:p>
-      <w:pPr>
-        <w:pStyle w:val="Heading2"/>
-      </w:pPr>
-      <w:r>
-        <w:t xml:space="preserve">Anexo C — Enlaces</w:t>
-      </w:r>
-    </w:p>
-    <w:p>
-      <w:pPr>
-        <w:numPr>
-          <w:ilvl w:val="0"/>
-          <w:numId w:val="1028"/>
-        </w:numPr>
-        <w:pStyle w:val="Compact"/>
-      </w:pPr>
-      <w:r>
-        <w:rPr>
-          <w:bCs/>
-          <w:b/>
-        </w:rPr>
-        <w:t xml:space="preserve">Código fuente en GitHub:</w:t>
-      </w:r>
-      <w:r>
-        <w:t xml:space="preserve"> </w:t>
-      </w:r>
-      <w:r>
-        <w:t xml:space="preserve">https://github.com/husslesnake/TFGDAM</w:t>
-      </w:r>
-    </w:p>
-    <w:p>
-      <w:pPr>
-        <w:numPr>
-          <w:ilvl w:val="0"/>
-          <w:numId w:val="1028"/>
-        </w:numPr>
-        <w:pStyle w:val="Compact"/>
-      </w:pPr>
-      <w:r>
-        <w:rPr>
-          <w:bCs/>
-          <w:b/>
-        </w:rPr>
-        <w:t xml:space="preserve">Aplicación web en producción:</w:t>
-      </w:r>
-      <w:r>
-        <w:t xml:space="preserve"> </w:t>
-      </w:r>
-      <w:r>
-        <w:t xml:space="preserve">https://tfgdam-production.up.railway.app/</w:t>
-      </w:r>
-    </w:p>
-    <w:p>
-      <w:pPr>
-        <w:numPr>
-          <w:ilvl w:val="0"/>
-          <w:numId w:val="1028"/>
-        </w:numPr>
-        <w:pStyle w:val="Compact"/>
-      </w:pPr>
-      <w:r>
-        <w:rPr>
-          <w:bCs/>
-          <w:b/>
-        </w:rPr>
-        <w:t xml:space="preserve">Documentación interactiva (Swagger UI):</w:t>
-      </w:r>
-      <w:r>
-        <w:t xml:space="preserve"> </w:t>
-      </w:r>
-      <w:r>
-        <w:t xml:space="preserve">https://tfgdam-production.up.railway.app/api/docs</w:t>
-      </w:r>
-    </w:p>
-    <w:p>
-      <w:pPr>
-        <w:numPr>
-          <w:ilvl w:val="0"/>
-          <w:numId w:val="1028"/>
         </w:numPr>
         <w:pStyle w:val="Compact"/>
       </w:pPr>
@@ -13906,34 +13800,7 @@
     <w:abstractNumId w:val="991"/>
   </w:num>
   <w:num w:numId="1023">
-    <w:abstractNumId w:val="99411"/>
-    <w:lvlOverride w:ilvl="0">
-      <w:startOverride w:val="1"/>
-    </w:lvlOverride>
-    <w:lvlOverride w:ilvl="1">
-      <w:startOverride w:val="1"/>
-    </w:lvlOverride>
-    <w:lvlOverride w:ilvl="2">
-      <w:startOverride w:val="1"/>
-    </w:lvlOverride>
-    <w:lvlOverride w:ilvl="3">
-      <w:startOverride w:val="1"/>
-    </w:lvlOverride>
-    <w:lvlOverride w:ilvl="4">
-      <w:startOverride w:val="1"/>
-    </w:lvlOverride>
-    <w:lvlOverride w:ilvl="5">
-      <w:startOverride w:val="1"/>
-    </w:lvlOverride>
-    <w:lvlOverride w:ilvl="6">
-      <w:startOverride w:val="1"/>
-    </w:lvlOverride>
-    <w:lvlOverride w:ilvl="7">
-      <w:startOverride w:val="1"/>
-    </w:lvlOverride>
-    <w:lvlOverride w:ilvl="8">
-      <w:startOverride w:val="1"/>
-    </w:lvlOverride>
+    <w:abstractNumId w:val="991"/>
   </w:num>
   <w:num w:numId="1024">
     <w:abstractNumId w:val="991"/>
@@ -13945,9 +13812,6 @@
     <w:abstractNumId w:val="991"/>
   </w:num>
   <w:num w:numId="1027">
-    <w:abstractNumId w:val="991"/>
-  </w:num>
-  <w:num w:numId="1028">
     <w:abstractNumId w:val="991"/>
   </w:num>
 </w:numbering>

</xml_diff>